<commit_message>
added two new features - SEC file scrape/summarize and conversion of PDFs to MD both for LLM input to summarize SEC filings
</commit_message>
<xml_diff>
--- a/InvestmentBlogs/QuantumYieldsBlog.docx
+++ b/InvestmentBlogs/QuantumYieldsBlog.docx
@@ -71,7 +71,7 @@
                     <pic:cNvPicPr/>
                   </pic:nvPicPr>
                   <pic:blipFill>
-                    <a:blip r:embed="rId5"/>
+                    <a:blip r:embed="rId7"/>
                     <a:stretch>
                       <a:fillRect/>
                     </a:stretch>
@@ -103,7 +103,23 @@
     </w:p>
     <w:p>
       <w:r>
-        <w:t xml:space="preserve">As stated from their 10k, Monolithic Power Systems Inc. (MPS) is a “fabless global company that provides high-performance, semiconductor-based power electronics solutions.”. This essentially means they design the semiconductors that their customers buy but they outsource the manufacturing to a third party. This has both advantages and disadvantages but the key advantage is that MPS has lower capital expenditures and can focus on R&amp;D and delivery innovative solutions to their customers. Many other companies like NVIDIA, Qualcomm, AMD, and Broadcom also follow this approach. </w:t>
+        <w:t xml:space="preserve">As stated from their 10k, Monolithic Power Systems Inc. (MPS) is a “fabless global company that provides high-performance, semiconductor-based power electronics solutions.”. This essentially means they design the semiconductors that their customers buy but they outsource the manufacturing to a third party. This has both advantages and </w:t>
+      </w:r>
+      <w:proofErr w:type="gramStart"/>
+      <w:r>
+        <w:t>disadvantages</w:t>
+      </w:r>
+      <w:proofErr w:type="gramEnd"/>
+      <w:r>
+        <w:t xml:space="preserve"> but the key advantage is that MPS has lower capital </w:t>
+      </w:r>
+      <w:proofErr w:type="gramStart"/>
+      <w:r>
+        <w:t>expenditures</w:t>
+      </w:r>
+      <w:proofErr w:type="gramEnd"/>
+      <w:r>
+        <w:t xml:space="preserve"> and can focus on R&amp;D and delivery innovative solutions to their customers. Many other companies like NVIDIA, Qualcomm, AMD, and Broadcom also follow this approach. </w:t>
       </w:r>
     </w:p>
     <w:p>
@@ -114,7 +130,15 @@
     <w:p>
       <w:r>
         <w:lastRenderedPageBreak/>
-        <w:t>MPS focuses on the analog and mixed-signal integrated circuit markets which differs from digital integrated circuit markets but the markets are wide and diverse. Below MPS’s revenue by end market and applications as of end of 2023:</w:t>
+        <w:t xml:space="preserve">MPS focuses on the analog and mixed-signal integrated circuit markets which differs from digital integrated circuit </w:t>
+      </w:r>
+      <w:proofErr w:type="gramStart"/>
+      <w:r>
+        <w:t>markets</w:t>
+      </w:r>
+      <w:proofErr w:type="gramEnd"/>
+      <w:r>
+        <w:t xml:space="preserve"> but the markets are wide and diverse. Below MPS’s revenue by end market and applications as of end of 2023:</w:t>
       </w:r>
     </w:p>
     <w:p/>
@@ -417,7 +441,15 @@
     <w:p/>
     <w:p>
       <w:r>
-        <w:t>Its competitors include: Analog Devices, Infineon Technologies, NXP Semiconductors, ON Semiconductor, Power Integrations, Renesas Electronics, ROHM Semiconductor, Semtech, STMicroelectronics and Texas Instruments.</w:t>
+        <w:t xml:space="preserve">Its competitors </w:t>
+      </w:r>
+      <w:proofErr w:type="gramStart"/>
+      <w:r>
+        <w:t>include:</w:t>
+      </w:r>
+      <w:proofErr w:type="gramEnd"/>
+      <w:r>
+        <w:t xml:space="preserve"> Analog Devices, Infineon Technologies, NXP Semiconductors, ON Semiconductor, Power Integrations, Renesas Electronics, ROHM Semiconductor, Semtech, STMicroelectronics and Texas Instruments.</w:t>
       </w:r>
     </w:p>
     <w:p>
@@ -430,12 +462,36 @@
     </w:p>
     <w:p>
       <w:r>
-        <w:t xml:space="preserve">Here are some of the key metrics to consider. In general, I like to look for management’s ability to increase return on equity and invested capital, rely little on debt, and have ample liquidity to handle volatile times. Though this snapshot is over the past 5 years, if you go back further in time you’ll see improvement across all these metrics since the beginning of MPS’ formation. </w:t>
-      </w:r>
-    </w:p>
-    <w:p>
-      <w:r>
-        <w:t>I can’t say I like any single thing here the most, but I do like to see that management is disciplined  about managing debt and cash and being able to consistently return value to shareholders year after year.</w:t>
+        <w:t xml:space="preserve">Here are some of the key metrics to consider. In general, I like to look for management’s ability to increase return on equity and invested capital, rely little on debt, and have ample liquidity to handle volatile times. Though this snapshot </w:t>
+      </w:r>
+      <w:proofErr w:type="gramStart"/>
+      <w:r>
+        <w:t>is</w:t>
+      </w:r>
+      <w:proofErr w:type="gramEnd"/>
+      <w:r>
+        <w:t xml:space="preserve"> over the past 5 years, if you go back further in </w:t>
+      </w:r>
+      <w:proofErr w:type="gramStart"/>
+      <w:r>
+        <w:t>time</w:t>
+      </w:r>
+      <w:proofErr w:type="gramEnd"/>
+      <w:r>
+        <w:t xml:space="preserve"> you’ll see improvement across all these metrics since the beginning of MPS’ formation. </w:t>
+      </w:r>
+    </w:p>
+    <w:p>
+      <w:r>
+        <w:t xml:space="preserve">I can’t say I like any single thing here the most, but I do like to see that management is </w:t>
+      </w:r>
+      <w:proofErr w:type="gramStart"/>
+      <w:r>
+        <w:t>disciplined  about</w:t>
+      </w:r>
+      <w:proofErr w:type="gramEnd"/>
+      <w:r>
+        <w:t xml:space="preserve"> managing debt and cash and being able to consistently return value to shareholders year after year.</w:t>
       </w:r>
     </w:p>
     <w:p/>
@@ -1233,7 +1289,15 @@
         <w:t>Monolith focuses on highly integrated power management chips</w:t>
       </w:r>
       <w:r>
-        <w:t xml:space="preserve"> which provides superior levels of reliability and convenience for their customers which subsequently results in high switching costs.</w:t>
+        <w:t xml:space="preserve"> which </w:t>
+      </w:r>
+      <w:proofErr w:type="gramStart"/>
+      <w:r>
+        <w:t>provides</w:t>
+      </w:r>
+      <w:proofErr w:type="gramEnd"/>
+      <w:r>
+        <w:t xml:space="preserve"> superior levels of reliability and convenience for their customers which subsequently results in high switching costs.</w:t>
       </w:r>
     </w:p>
     <w:p>
@@ -1248,7 +1312,7 @@
       <w:r>
         <w:t xml:space="preserve">The greatest risk to MPS is its exposure to China. A third of their revenue comes from Chinese customers and a portion of their manufacturing relies on Chinese foundries (with the remaining in Taiwan, South Korea, and Singapore). Given Donald Trump has won the most recent Presidential election, one can expect increased pressure on Chinese imports which could raise the cost of Chinese imported products as well as put pressure on Chinese consumers. Beijing, however, has been watching U.S. elections closely and recently revealed a </w:t>
       </w:r>
-      <w:hyperlink r:id="rId6" w:history="1">
+      <w:hyperlink r:id="rId8" w:history="1">
         <w:r>
           <w:rPr>
             <w:rStyle w:val="Hyperlink"/>
@@ -1370,7 +1434,15 @@
     </w:p>
     <w:p>
       <w:r>
-        <w:t>In the two graphs below you can see how TPL’s stock price has appreciated over the past year and has outperformed the S&amp;P 500 (which they are expected to join in the next year) by a wide margin. In this blog I’ll talk more about what’s driving this and call out some price targets and risks.</w:t>
+        <w:t xml:space="preserve">In the two graphs below you can see how TPL’s stock price has </w:t>
+      </w:r>
+      <w:proofErr w:type="gramStart"/>
+      <w:r>
+        <w:t>appreciated</w:t>
+      </w:r>
+      <w:proofErr w:type="gramEnd"/>
+      <w:r>
+        <w:t xml:space="preserve"> over the past year and has outperformed the S&amp;P 500 (which they are expected to join in the next year) by a wide margin. In this blog I’ll talk more about what’s driving this and call out some price targets and risks.</w:t>
       </w:r>
     </w:p>
     <w:p>
@@ -1395,7 +1467,7 @@
                     <pic:cNvPicPr/>
                   </pic:nvPicPr>
                   <pic:blipFill>
-                    <a:blip r:embed="rId7"/>
+                    <a:blip r:embed="rId9"/>
                     <a:stretch>
                       <a:fillRect/>
                     </a:stretch>
@@ -1449,7 +1521,7 @@
                     <pic:cNvPicPr/>
                   </pic:nvPicPr>
                   <pic:blipFill>
-                    <a:blip r:embed="rId8"/>
+                    <a:blip r:embed="rId10"/>
                     <a:stretch>
                       <a:fillRect/>
                     </a:stretch>
@@ -1485,13 +1557,29 @@
     </w:p>
     <w:p>
       <w:r>
-        <w:t>TPL’s asset is land ownership and mineral rights. Oil &amp; gas companies lease the</w:t>
+        <w:t xml:space="preserve">TPL’s </w:t>
+      </w:r>
+      <w:proofErr w:type="gramStart"/>
+      <w:r>
+        <w:t>asset is</w:t>
+      </w:r>
+      <w:proofErr w:type="gramEnd"/>
+      <w:r>
+        <w:t xml:space="preserve"> land ownership and mineral rights. Oil &amp; gas companies lease the</w:t>
       </w:r>
       <w:r>
         <w:t>ir</w:t>
       </w:r>
       <w:r>
-        <w:t xml:space="preserve"> land and pay a portion of their revenues to TPL in the form of royalties. TPL spends very little capital to maintain their asset and in turn receives royalties which </w:t>
+        <w:t xml:space="preserve"> land and pay a portion of their revenues to TPL in the form of royalties. TPL spends very little capital to maintain their </w:t>
+      </w:r>
+      <w:proofErr w:type="gramStart"/>
+      <w:r>
+        <w:t>asset</w:t>
+      </w:r>
+      <w:proofErr w:type="gramEnd"/>
+      <w:r>
+        <w:t xml:space="preserve"> and in turn receives royalties which </w:t>
       </w:r>
       <w:r>
         <w:t xml:space="preserve">are </w:t>
@@ -1611,10 +1699,18 @@
     </w:p>
     <w:p>
       <w:r>
-        <w:t xml:space="preserve">Their moat is quite </w:t>
-      </w:r>
-      <w:r>
-        <w:t>obvious – they own 868,000 surface acres in t</w:t>
+        <w:t xml:space="preserve">Their moat is </w:t>
+      </w:r>
+      <w:proofErr w:type="gramStart"/>
+      <w:r>
+        <w:t xml:space="preserve">quite </w:t>
+      </w:r>
+      <w:r>
+        <w:t>obvious</w:t>
+      </w:r>
+      <w:proofErr w:type="gramEnd"/>
+      <w:r>
+        <w:t xml:space="preserve"> – they own 868,000 surface acres in t</w:t>
       </w:r>
       <w:r>
         <w:t>he Permian is the most productive oil, gas, and NGL play</w:t>
@@ -1647,7 +1743,15 @@
         <w:t xml:space="preserve">ample infrastructure </w:t>
       </w:r>
       <w:r>
-        <w:t>to move product and if there isn’t sufficient pipeline, well, it is TX so building or expanding pipe is not really a bottleneck.</w:t>
+        <w:t xml:space="preserve">to move </w:t>
+      </w:r>
+      <w:proofErr w:type="gramStart"/>
+      <w:r>
+        <w:t>product</w:t>
+      </w:r>
+      <w:proofErr w:type="gramEnd"/>
+      <w:r>
+        <w:t xml:space="preserve"> and if there isn’t sufficient pipeline, well, it is TX so building or expanding pipe is not really a bottleneck.</w:t>
       </w:r>
       <w:r>
         <w:t xml:space="preserve"> Second, TX export infrastructure continues to grow so even if there is lack of demand in the U.S., export markets are a safe outlet. Lastly, WTX irradiation is also amongst the best in the country so TPL could hedge their oil royalties with solar capacity buildout.</w:t>
@@ -1732,8 +1836,13 @@
     </w:p>
     <w:p>
       <w:r>
-        <w:t>If any turn out to be interesting I’ll follow up in another blog, but</w:t>
-      </w:r>
+        <w:t xml:space="preserve">If any turn out to be interesting I’ll follow up in another </w:t>
+      </w:r>
+      <w:proofErr w:type="gramStart"/>
+      <w:r>
+        <w:t>blog, but</w:t>
+      </w:r>
+      <w:proofErr w:type="gramEnd"/>
       <w:r>
         <w:t xml:space="preserve"> </w:t>
       </w:r>
@@ -1785,7 +1894,15 @@
         <w:t xml:space="preserve"> natural</w:t>
       </w:r>
       <w:r>
-        <w:t xml:space="preserve"> gas which, if paired with carbon capture, could be a perceived as </w:t>
+        <w:t xml:space="preserve"> gas which, if paired with carbon capture, could be </w:t>
+      </w:r>
+      <w:proofErr w:type="gramStart"/>
+      <w:r>
+        <w:t>a perceived</w:t>
+      </w:r>
+      <w:proofErr w:type="gramEnd"/>
+      <w:r>
+        <w:t xml:space="preserve"> as </w:t>
       </w:r>
       <w:r>
         <w:lastRenderedPageBreak/>
@@ -1810,8 +1927,13 @@
     </w:p>
     <w:p>
       <w:r>
-        <w:t>Based on today’s current price and a discounted cash flow model we can infer the market is assuming the following on TPL :</w:t>
-      </w:r>
+        <w:t xml:space="preserve">Based on today’s current price and a discounted cash flow model we can infer the market is assuming the following on </w:t>
+      </w:r>
+      <w:proofErr w:type="gramStart"/>
+      <w:r>
+        <w:t>TPL :</w:t>
+      </w:r>
+      <w:proofErr w:type="gramEnd"/>
     </w:p>
     <w:p>
       <w:pPr>
@@ -1825,7 +1947,17 @@
         <w:t>Discount rate: 7%</w:t>
       </w:r>
       <w:r>
-        <w:t xml:space="preserve"> (10-year treasuries are ~ 4.2% so I added a small risk premium which is inline with many real estate companies who act as lessors)</w:t>
+        <w:t xml:space="preserve"> (10-year treasuries are ~ 4.2% so I added a small risk premium which is </w:t>
+      </w:r>
+      <w:proofErr w:type="spellStart"/>
+      <w:proofErr w:type="gramStart"/>
+      <w:r>
+        <w:t>inline</w:t>
+      </w:r>
+      <w:proofErr w:type="spellEnd"/>
+      <w:proofErr w:type="gramEnd"/>
+      <w:r>
+        <w:t xml:space="preserve"> with many real estate companies who act as lessors)</w:t>
       </w:r>
     </w:p>
     <w:p>
@@ -1837,7 +1969,15 @@
         </w:numPr>
       </w:pPr>
       <w:r>
-        <w:t>FCF of $415MM growing annually 11%-12% with a terminal growth rate of 5%</w:t>
+        <w:t xml:space="preserve">FCF </w:t>
+      </w:r>
+      <w:proofErr w:type="gramStart"/>
+      <w:r>
+        <w:t>of</w:t>
+      </w:r>
+      <w:proofErr w:type="gramEnd"/>
+      <w:r>
+        <w:t xml:space="preserve"> $415MM growing annually 11%-12% with a terminal growth rate of 5%</w:t>
       </w:r>
     </w:p>
     <w:p>
@@ -1891,7 +2031,15 @@
         <w:t>s</w:t>
       </w:r>
       <w:r>
-        <w:t xml:space="preserve"> look a slightly more optimistic scenario to estimate what this stock could be worth.</w:t>
+        <w:t xml:space="preserve"> </w:t>
+      </w:r>
+      <w:proofErr w:type="gramStart"/>
+      <w:r>
+        <w:t>look</w:t>
+      </w:r>
+      <w:proofErr w:type="gramEnd"/>
+      <w:r>
+        <w:t xml:space="preserve"> a slightly more optimistic scenario to estimate what this stock could be worth.</w:t>
       </w:r>
     </w:p>
     <w:p>
@@ -1919,8 +2067,13 @@
           <w:numId w:val="3"/>
         </w:numPr>
       </w:pPr>
-      <w:r>
-        <w:t>FCF of $415MM growing annually over 10 years at 20% with a terminal growth rate of 5%</w:t>
+      <w:proofErr w:type="gramStart"/>
+      <w:r>
+        <w:t>FCF of</w:t>
+      </w:r>
+      <w:proofErr w:type="gramEnd"/>
+      <w:r>
+        <w:t xml:space="preserve"> $415MM growing annually over 10 years at 20% with a terminal growth rate of 5%</w:t>
       </w:r>
       <w:r>
         <w:t xml:space="preserve"> </w:t>
@@ -2052,7 +2205,15 @@
       </w:r>
       <w:r>
         <w:lastRenderedPageBreak/>
-        <w:t xml:space="preserve">know how cutthroat it is and how critical the need is to make right calls with appropriate hedging mechanisms in place. Being a fundamentals analyst has served me well </w:t>
+        <w:t xml:space="preserve">know how cutthroat it is and how critical the need is to make </w:t>
+      </w:r>
+      <w:proofErr w:type="gramStart"/>
+      <w:r>
+        <w:t>right</w:t>
+      </w:r>
+      <w:proofErr w:type="gramEnd"/>
+      <w:r>
+        <w:t xml:space="preserve"> calls with appropriate hedging mechanisms in place. Being a fundamentals analyst has served me well </w:t>
       </w:r>
       <w:r>
         <w:t>and</w:t>
@@ -2119,7 +2280,7 @@
                     <pic:cNvPicPr/>
                   </pic:nvPicPr>
                   <pic:blipFill>
-                    <a:blip r:embed="rId9"/>
+                    <a:blip r:embed="rId11"/>
                     <a:stretch>
                       <a:fillRect/>
                     </a:stretch>
@@ -2169,7 +2330,17 @@
         <w:t>y</w:t>
       </w:r>
       <w:r>
-        <w:t xml:space="preserve"> time learning deeply about a few companies or industries and leveraging my expertise than to reach outside my sphere of knowledge. Healthcare companies are a great example of a type of equity I will never add to my portfolio simply because it is just outside the realm of what I read everyday.</w:t>
+        <w:t xml:space="preserve"> time learning deeply about a few companies or industries and leveraging my expertise than to reach outside my sphere of knowledge. Healthcare companies are a great example of a type of equity I will never add to my portfolio simply because it is just outside the realm of what I read </w:t>
+      </w:r>
+      <w:proofErr w:type="spellStart"/>
+      <w:proofErr w:type="gramStart"/>
+      <w:r>
+        <w:t>everyday</w:t>
+      </w:r>
+      <w:proofErr w:type="spellEnd"/>
+      <w:proofErr w:type="gramEnd"/>
+      <w:r>
+        <w:t>.</w:t>
       </w:r>
     </w:p>
     <w:p>
@@ -2196,8 +2367,13 @@
         </w:rPr>
         <w:t>th</w:t>
       </w:r>
-      <w:r>
-        <w:t xml:space="preserve"> 2024 to January 17</w:t>
+      <w:proofErr w:type="gramStart"/>
+      <w:r>
+        <w:t xml:space="preserve"> 2024</w:t>
+      </w:r>
+      <w:proofErr w:type="gramEnd"/>
+      <w:r>
+        <w:t xml:space="preserve"> to January 17</w:t>
       </w:r>
       <w:r>
         <w:rPr>
@@ -2586,7 +2762,15 @@
         <w:t>nearly</w:t>
       </w:r>
       <w:r>
-        <w:t xml:space="preserve"> 0 correlation.</w:t>
+        <w:t xml:space="preserve"> 0 </w:t>
+      </w:r>
+      <w:proofErr w:type="gramStart"/>
+      <w:r>
+        <w:t>correlation</w:t>
+      </w:r>
+      <w:proofErr w:type="gramEnd"/>
+      <w:r>
+        <w:t>.</w:t>
       </w:r>
     </w:p>
     <w:p>
@@ -2604,7 +2788,15 @@
         <w:t xml:space="preserve">in correlation </w:t>
       </w:r>
       <w:r>
-        <w:t>with respect to health of the economy which is largely underpinned by commodity prices.</w:t>
+        <w:t xml:space="preserve">with respect to </w:t>
+      </w:r>
+      <w:proofErr w:type="gramStart"/>
+      <w:r>
+        <w:t>health</w:t>
+      </w:r>
+      <w:proofErr w:type="gramEnd"/>
+      <w:r>
+        <w:t xml:space="preserve"> of the economy which is largely underpinned by commodity prices.</w:t>
       </w:r>
     </w:p>
     <w:p>
@@ -2622,7 +2814,15 @@
         <w:t>T</w:t>
       </w:r>
       <w:r>
-        <w:t>his is sufficient risk to take on in return for double digit returns.</w:t>
+        <w:t xml:space="preserve">his is sufficient risk to </w:t>
+      </w:r>
+      <w:proofErr w:type="gramStart"/>
+      <w:r>
+        <w:t>take on</w:t>
+      </w:r>
+      <w:proofErr w:type="gramEnd"/>
+      <w:r>
+        <w:t xml:space="preserve"> in return for double digit returns.</w:t>
       </w:r>
       <w:r>
         <w:t xml:space="preserve"> </w:t>
@@ -2761,7 +2961,15 @@
         <w:t xml:space="preserve"> and set on reducing business friction in the U.S. However, he also has vowed to place tariffs on foreign goods and deport illegal immigrants</w:t>
       </w:r>
       <w:r>
-        <w:t xml:space="preserve">, which, if executed unthoughtfully, could actually result in an increase in prices or inflation and completely derail </w:t>
+        <w:t xml:space="preserve">, which, if executed unthoughtfully, could </w:t>
+      </w:r>
+      <w:proofErr w:type="gramStart"/>
+      <w:r>
+        <w:t>actually result</w:t>
+      </w:r>
+      <w:proofErr w:type="gramEnd"/>
+      <w:r>
+        <w:t xml:space="preserve"> in an increase in prices or inflation and completely derail </w:t>
       </w:r>
       <w:r>
         <w:t>the economy</w:t>
@@ -2790,12 +2998,28 @@
     </w:p>
     <w:p>
       <w:r>
-        <w:t>This infrastructure growth is being fueled by advancements in AI and machine learning. If you’ve been paying attention, folks like Jensen Huang are calling these the early days of AI with many making comparisons to the early days of the internet. We have entered a new growth era and looking for ways to ride this wave with as little risk as possible.</w:t>
-      </w:r>
-    </w:p>
-    <w:p>
-      <w:r>
-        <w:t xml:space="preserve">This is what brings me to data centers. All the large tech companies (Google, Meta, Microsoft, Amazon, etc.) are spending billions on data centers and there is just not enough energy available to support the demand.  This is why alternative asset companies look highly attractive. They do invest in data center operations but their portfolios are generally much larger and wider than that and that’s what we’ll discuss in this blog and </w:t>
+        <w:t xml:space="preserve">This infrastructure growth is being fueled by advancements in AI and machine learning. If you’ve been paying attention, folks like Jensen Huang are calling these the early days of AI with many making comparisons to the early days of the internet. We have entered a new growth era and </w:t>
+      </w:r>
+      <w:proofErr w:type="gramStart"/>
+      <w:r>
+        <w:t>looking</w:t>
+      </w:r>
+      <w:proofErr w:type="gramEnd"/>
+      <w:r>
+        <w:t xml:space="preserve"> for ways to ride this wave with as little risk as possible.</w:t>
+      </w:r>
+    </w:p>
+    <w:p>
+      <w:r>
+        <w:t xml:space="preserve">This is what brings me to data centers. All the large tech companies (Google, Meta, Microsoft, Amazon, etc.) are spending billions on data centers and there is just not enough energy available to support the demand.  This is why alternative asset companies look highly attractive. They do invest in data center </w:t>
+      </w:r>
+      <w:proofErr w:type="gramStart"/>
+      <w:r>
+        <w:t>operations</w:t>
+      </w:r>
+      <w:proofErr w:type="gramEnd"/>
+      <w:r>
+        <w:t xml:space="preserve"> but their portfolios are generally much larger and wider than that and that’s what we’ll discuss in this blog and </w:t>
       </w:r>
       <w:r>
         <w:t>see if we can identify an investment opportunity in KKR or other alternative asset investment companies.</w:t>
@@ -2892,7 +3116,15 @@
     <w:p/>
     <w:p>
       <w:r>
-        <w:t xml:space="preserve">All of them have done relatively well, beating the S&amp;P 500, but one in particular stands out and that is KKR which returned 93% over the past year, significantly higher than the S&amp;P’s ~23%. </w:t>
+        <w:t xml:space="preserve">All of them have done relatively well, beating the S&amp;P 500, but one </w:t>
+      </w:r>
+      <w:proofErr w:type="gramStart"/>
+      <w:r>
+        <w:t>in particular stands</w:t>
+      </w:r>
+      <w:proofErr w:type="gramEnd"/>
+      <w:r>
+        <w:t xml:space="preserve"> out and that is KKR which returned 93% over the past year, significantly higher than the S&amp;P’s ~23%. </w:t>
       </w:r>
     </w:p>
     <w:p>
@@ -2916,7 +3148,7 @@
                     <pic:cNvPicPr/>
                   </pic:nvPicPr>
                   <pic:blipFill>
-                    <a:blip r:embed="rId10" cstate="print">
+                    <a:blip r:embed="rId12" cstate="print">
                       <a:extLst>
                         <a:ext uri="{28A0092B-C50C-407E-A947-70E740481C1C}">
                           <a14:useLocalDpi xmlns:a14="http://schemas.microsoft.com/office/drawing/2010/main" val="0"/>
@@ -3139,7 +3371,15 @@
       </w:pPr>
       <w:r>
         <w:lastRenderedPageBreak/>
-        <w:t>“…focuses on achieving multiples of invested capital and attractive risk-adjusted IRRs..”</w:t>
+        <w:t xml:space="preserve">“…focuses on achieving multiples of invested capital and attractive risk-adjusted </w:t>
+      </w:r>
+      <w:proofErr w:type="gramStart"/>
+      <w:r>
+        <w:t>IRRs..</w:t>
+      </w:r>
+      <w:proofErr w:type="gramEnd"/>
+      <w:r>
+        <w:t>”</w:t>
       </w:r>
     </w:p>
     <w:p>
@@ -3611,7 +3851,15 @@
     <w:p/>
     <w:p>
       <w:r>
-        <w:t>KKR now relies heavily on these fees to produce consistent revenue. This is one differentiating factor of KKR compared to their peers and over the past few years they’ve built a strong pipeline of fee collections which gives investors better insight into cash flows. However, they are also heavily reliant on carried interest which, if you observe their “other liabilities” section of the balance sheet, you’ll see how large this number is. In volatile times, this large exposure to carried interest will make earnings and cash flow much less predictable.</w:t>
+        <w:t xml:space="preserve">KKR now relies heavily on these fees to produce consistent revenue. This is one differentiating factor of KKR compared to their peers and over the past few years they’ve built a strong pipeline of fee collections which gives investors better insight into cash </w:t>
+      </w:r>
+      <w:proofErr w:type="gramStart"/>
+      <w:r>
+        <w:t>flows</w:t>
+      </w:r>
+      <w:proofErr w:type="gramEnd"/>
+      <w:r>
+        <w:t>. However, they are also heavily reliant on carried interest which, if you observe their “other liabilities” section of the balance sheet, you’ll see how large this number is. In volatile times, this large exposure to carried interest will make earnings and cash flow much less predictable.</w:t>
       </w:r>
     </w:p>
     <w:p>
@@ -4396,7 +4644,15 @@
     <w:p>
       <w:r>
         <w:lastRenderedPageBreak/>
-        <w:t>Comparing KKR’s financials to their competitors, we see below that they have outpaced pretty much all of their competitors with the exception of Blackstone.</w:t>
+        <w:t xml:space="preserve">Comparing KKR’s financials to their competitors, we see below that they have outpaced pretty much </w:t>
+      </w:r>
+      <w:proofErr w:type="gramStart"/>
+      <w:r>
+        <w:t>all of</w:t>
+      </w:r>
+      <w:proofErr w:type="gramEnd"/>
+      <w:r>
+        <w:t xml:space="preserve"> their competitors with the exception of Blackstone.</w:t>
       </w:r>
     </w:p>
     <w:p>
@@ -4572,7 +4828,15 @@
     </w:p>
     <w:p>
       <w:r>
-        <w:t xml:space="preserve">The amount of long-term debt they have is significant. At the end of 2023, they were holding more than $49,187 MM in long-term debt. Compare that to Blackrock who is </w:t>
+        <w:t xml:space="preserve">The amount of long-term debt they have is significant. At the end of 2023, they were holding more than $49,187 MM in long-term debt. </w:t>
+      </w:r>
+      <w:proofErr w:type="gramStart"/>
+      <w:r>
+        <w:t>Compare</w:t>
+      </w:r>
+      <w:proofErr w:type="gramEnd"/>
+      <w:r>
+        <w:t xml:space="preserve"> that to Blackrock who is </w:t>
       </w:r>
       <w:r>
         <w:t xml:space="preserve">the largest in this group in terms of AUM and </w:t>
@@ -4584,7 +4848,23 @@
         <w:t>$7,918 MM in long-term debt</w:t>
       </w:r>
       <w:r>
-        <w:t xml:space="preserve">. Only BN has taken on more long-term debt but this is do to their business model which focuses on real infrastructure assets. </w:t>
+        <w:t xml:space="preserve">. Only BN has taken on more long-term </w:t>
+      </w:r>
+      <w:proofErr w:type="gramStart"/>
+      <w:r>
+        <w:t>debt</w:t>
+      </w:r>
+      <w:proofErr w:type="gramEnd"/>
+      <w:r>
+        <w:t xml:space="preserve"> but this is </w:t>
+      </w:r>
+      <w:proofErr w:type="spellStart"/>
+      <w:r>
+        <w:t>do</w:t>
+      </w:r>
+      <w:proofErr w:type="spellEnd"/>
+      <w:r>
+        <w:t xml:space="preserve"> to their business model which focuses on real infrastructure assets. </w:t>
       </w:r>
       <w:r>
         <w:t>Over the past several years KKR has set itself up nicely to strategically invest in a diverse set of assets which are expected to generate long-term, consistent revenue</w:t>
@@ -5354,7 +5634,15 @@
         </w:tabs>
       </w:pPr>
       <w:r>
-        <w:t>KKR is extremely efficient is its employee impact with a gross revenue per employee at $3.18MM. No one else is even close. Secondly, they are carrying a very large amount of long-term debt with respect to equity, demonstrating their dedication to long-term investments.</w:t>
+        <w:t xml:space="preserve">KKR is extremely efficient </w:t>
+      </w:r>
+      <w:proofErr w:type="gramStart"/>
+      <w:r>
+        <w:t>is</w:t>
+      </w:r>
+      <w:proofErr w:type="gramEnd"/>
+      <w:r>
+        <w:t xml:space="preserve"> its employee impact with a gross revenue per employee at $3.18MM. No one else is even close. Secondly, they are carrying a very large amount of long-term debt with respect to equity, demonstrating their dedication to long-term investments.</w:t>
       </w:r>
     </w:p>
     <w:p>
@@ -5411,7 +5699,15 @@
         </w:tabs>
       </w:pPr>
       <w:r>
-        <w:t>The table below illustrates current valuation of each of these companies.</w:t>
+        <w:t xml:space="preserve">The table below illustrates </w:t>
+      </w:r>
+      <w:proofErr w:type="gramStart"/>
+      <w:r>
+        <w:t>current</w:t>
+      </w:r>
+      <w:proofErr w:type="gramEnd"/>
+      <w:r>
+        <w:t xml:space="preserve"> valuation of each of these companies.</w:t>
       </w:r>
     </w:p>
     <w:tbl>
@@ -5896,7 +6192,15 @@
         <w:t>H</w:t>
       </w:r>
       <w:r>
-        <w:t xml:space="preserve">owever, these aren’t exactly apples-to-apples comparisons </w:t>
+        <w:t xml:space="preserve">owever, these aren’t exactly </w:t>
+      </w:r>
+      <w:proofErr w:type="gramStart"/>
+      <w:r>
+        <w:t>apples</w:t>
+      </w:r>
+      <w:proofErr w:type="gramEnd"/>
+      <w:r>
+        <w:t xml:space="preserve">-to-apples comparisons </w:t>
       </w:r>
       <w:r>
         <w:t>as all these companies</w:t>
@@ -5911,7 +6215,15 @@
         <w:t>summary</w:t>
       </w:r>
       <w:r>
-        <w:t xml:space="preserve"> on these valuation metrics for each company and which one may be more appropriate:</w:t>
+        <w:t xml:space="preserve"> </w:t>
+      </w:r>
+      <w:proofErr w:type="gramStart"/>
+      <w:r>
+        <w:t>on</w:t>
+      </w:r>
+      <w:proofErr w:type="gramEnd"/>
+      <w:r>
+        <w:t xml:space="preserve"> these valuation metrics for each company and which one may be more appropriate:</w:t>
       </w:r>
     </w:p>
     <w:p/>
@@ -5999,8 +6311,13 @@
             <w:tcW w:w="3117" w:type="dxa"/>
           </w:tcPr>
           <w:p>
-            <w:r>
-              <w:t>Relies on performance fees &amp; insurance cash flows; AUM-based valuation is key.</w:t>
+            <w:proofErr w:type="gramStart"/>
+            <w:r>
+              <w:t>Relies</w:t>
+            </w:r>
+            <w:proofErr w:type="gramEnd"/>
+            <w:r>
+              <w:t xml:space="preserve"> on performance fees &amp; insurance cash flows; AUM-based valuation is key.</w:t>
             </w:r>
           </w:p>
         </w:tc>
@@ -6143,15 +6460,45 @@
     <w:p/>
     <w:p>
       <w:r>
-        <w:t xml:space="preserve">Given KKR is most similar to CG and BX, let’s look at P/CF and EV/AUM for these three firms. KKR is clearly trading at a premium to these two on an EV/AUM basis. The market has fallen in love with this stock and it looks to be relatively expensive. </w:t>
-      </w:r>
-    </w:p>
-    <w:p>
-      <w:r>
-        <w:t xml:space="preserve">On a P/CF basis, it is on-par with BX but far cheaper than CG. Again, this is still not a perfect apples-to-apples basis given slightly differing business models but we can still deduce that at least on an EV/AUM basis, these firms are currently aggressively-priced. </w:t>
-      </w:r>
-    </w:p>
-    <w:p>
+        <w:t xml:space="preserve">Given KKR is most </w:t>
+      </w:r>
+      <w:proofErr w:type="gramStart"/>
+      <w:r>
+        <w:t>similar to</w:t>
+      </w:r>
+      <w:proofErr w:type="gramEnd"/>
+      <w:r>
+        <w:t xml:space="preserve"> CG and BX, let’s look at P/CF and EV/AUM for these three firms. KKR is clearly trading at a premium to these two on an EV/AUM basis. The market has fallen in love with this </w:t>
+      </w:r>
+      <w:proofErr w:type="gramStart"/>
+      <w:r>
+        <w:t>stock</w:t>
+      </w:r>
+      <w:proofErr w:type="gramEnd"/>
+      <w:r>
+        <w:t xml:space="preserve"> and it looks to be relatively expensive. </w:t>
+      </w:r>
+    </w:p>
+    <w:p>
+      <w:r>
+        <w:t xml:space="preserve">On a P/CF basis, it is on-par with BX but far cheaper than CG. Again, this is still not a perfect apples-to-apples basis given slightly differing business </w:t>
+      </w:r>
+      <w:proofErr w:type="gramStart"/>
+      <w:r>
+        <w:t>models</w:t>
+      </w:r>
+      <w:proofErr w:type="gramEnd"/>
+      <w:r>
+        <w:t xml:space="preserve"> but we can still deduce that at least on an EV/AUM basis, these firms are currently aggressively-priced. </w:t>
+      </w:r>
+    </w:p>
+    <w:p>
+      <w:pPr>
+        <w:rPr>
+          <w:b/>
+          <w:bCs/>
+        </w:rPr>
+      </w:pPr>
       <w:r>
         <w:t>Research indicates that 10-16% EV/AUM is more “normal” for high-fee PE firms. Given this, KKR continue</w:t>
       </w:r>
@@ -6204,6 +6551,133 @@
           <w:bCs/>
         </w:rPr>
         <w:t xml:space="preserve"> to have a sufficient margin of safety.</w:t>
+      </w:r>
+    </w:p>
+    <w:p>
+      <w:pPr>
+        <w:rPr>
+          <w:b/>
+          <w:bCs/>
+        </w:rPr>
+      </w:pPr>
+    </w:p>
+    <w:p>
+      <w:pPr>
+        <w:rPr>
+          <w:b/>
+          <w:bCs/>
+        </w:rPr>
+      </w:pPr>
+      <w:r>
+        <w:rPr>
+          <w:b/>
+          <w:bCs/>
+        </w:rPr>
+        <w:t>Update since earnings call on 2/4/25:</w:t>
+      </w:r>
+    </w:p>
+    <w:p>
+      <w:r>
+        <w:t xml:space="preserve">KKR dropped </w:t>
+      </w:r>
+      <w:r>
+        <w:t>about 8.5%</w:t>
+      </w:r>
+      <w:r>
+        <w:t xml:space="preserve"> after their earnings </w:t>
+      </w:r>
+      <w:proofErr w:type="gramStart"/>
+      <w:r>
+        <w:t>was</w:t>
+      </w:r>
+      <w:proofErr w:type="gramEnd"/>
+      <w:r>
+        <w:t xml:space="preserve"> released on 2/4 to $149/share. Since </w:t>
+      </w:r>
+      <w:proofErr w:type="gramStart"/>
+      <w:r>
+        <w:t>then</w:t>
+      </w:r>
+      <w:proofErr w:type="gramEnd"/>
+      <w:r>
+        <w:t xml:space="preserve"> KKR bounced back about 3% to $154. This looks to be about as good a buying opportunity we will get. Furthermore, KKR pointed out some encouraging notes on their call that point to a continued long-term</w:t>
+      </w:r>
+      <w:r>
+        <w:t>, Berkshire Hathaway-</w:t>
+      </w:r>
+      <w:proofErr w:type="spellStart"/>
+      <w:r>
+        <w:t>ish</w:t>
+      </w:r>
+      <w:proofErr w:type="spellEnd"/>
+      <w:r>
+        <w:t xml:space="preserve"> type </w:t>
+      </w:r>
+      <w:r>
+        <w:t>of growth:</w:t>
+      </w:r>
+    </w:p>
+    <w:p>
+      <w:pPr>
+        <w:pStyle w:val="ListParagraph"/>
+        <w:numPr>
+          <w:ilvl w:val="0"/>
+          <w:numId w:val="19"/>
+        </w:numPr>
+      </w:pPr>
+      <w:r>
+        <w:t xml:space="preserve">Raising its stake in three existing holdings under its Strategic Holdings </w:t>
+      </w:r>
+      <w:proofErr w:type="gramStart"/>
+      <w:r>
+        <w:t>group</w:t>
+      </w:r>
+      <w:proofErr w:type="gramEnd"/>
+      <w:r>
+        <w:t xml:space="preserve"> which should support the group’s earnings. </w:t>
+      </w:r>
+    </w:p>
+    <w:p>
+      <w:pPr>
+        <w:pStyle w:val="ListParagraph"/>
+        <w:numPr>
+          <w:ilvl w:val="0"/>
+          <w:numId w:val="19"/>
+        </w:numPr>
+      </w:pPr>
+      <w:r>
+        <w:t xml:space="preserve">Annual profit was lower YOY, though earnings did beat </w:t>
+      </w:r>
+      <w:proofErr w:type="gramStart"/>
+      <w:r>
+        <w:t>analyst</w:t>
+      </w:r>
+      <w:proofErr w:type="gramEnd"/>
+      <w:r>
+        <w:t xml:space="preserve"> expectations.</w:t>
+      </w:r>
+    </w:p>
+    <w:p>
+      <w:pPr>
+        <w:pStyle w:val="ListParagraph"/>
+        <w:numPr>
+          <w:ilvl w:val="0"/>
+          <w:numId w:val="19"/>
+        </w:numPr>
+      </w:pPr>
+      <w:r>
+        <w:t xml:space="preserve"> CEO Scott Nuttall described 2024 as a “good year, not a great year” as they are still figuring things out internally, even though the stock’s price is up nearly 90% over the past year. Nuttall describes 2025 </w:t>
+      </w:r>
+      <w:r>
+        <w:t xml:space="preserve">as a year where things are expected to go relatively well or as he describes it in runner terms “the sun is out” and they’re “running on flat roads”. He also notes the dividend scaling opportunity is real and that the pipelines are </w:t>
+      </w:r>
+      <w:proofErr w:type="gramStart"/>
+      <w:r>
+        <w:t>opening up</w:t>
+      </w:r>
+      <w:proofErr w:type="gramEnd"/>
+      <w:r>
+        <w:t xml:space="preserve"> with more possible exits and opportunities globally across asset classes.</w:t>
       </w:r>
     </w:p>
     <w:sectPr>
@@ -6216,6 +6690,56 @@
 </w:document>
 </file>
 
+<file path=word/endnotes.xml><?xml version="1.0" encoding="utf-8"?>
+<w:endnotes xmlns:wpc="http://schemas.microsoft.com/office/word/2010/wordprocessingCanvas" xmlns:cx="http://schemas.microsoft.com/office/drawing/2014/chartex" xmlns:cx1="http://schemas.microsoft.com/office/drawing/2015/9/8/chartex" xmlns:cx2="http://schemas.microsoft.com/office/drawing/2015/10/21/chartex" xmlns:cx3="http://schemas.microsoft.com/office/drawing/2016/5/9/chartex" xmlns:cx4="http://schemas.microsoft.com/office/drawing/2016/5/10/chartex" xmlns:cx5="http://schemas.microsoft.com/office/drawing/2016/5/11/chartex" xmlns:cx6="http://schemas.microsoft.com/office/drawing/2016/5/12/chartex" xmlns:cx7="http://schemas.microsoft.com/office/drawing/2016/5/13/chartex" xmlns:cx8="http://schemas.microsoft.com/office/drawing/2016/5/14/chartex" xmlns:mc="http://schemas.openxmlformats.org/markup-compatibility/2006" xmlns:aink="http://schemas.microsoft.com/office/drawing/2016/ink" xmlns:am3d="http://schemas.microsoft.com/office/drawing/2017/model3d" xmlns:o="urn:schemas-microsoft-com:office:office" xmlns:oel="http://schemas.microsoft.com/office/2019/extlst" xmlns:r="http://schemas.openxmlformats.org/officeDocument/2006/relationships" xmlns:m="http://schemas.openxmlformats.org/officeDocument/2006/math" xmlns:v="urn:schemas-microsoft-com:vml" xmlns:wp14="http://schemas.microsoft.com/office/word/2010/wordprocessingDrawing" xmlns:wp="http://schemas.openxmlformats.org/drawingml/2006/wordprocessingDrawing" xmlns:w10="urn:schemas-microsoft-com:office:word" xmlns:w="http://schemas.openxmlformats.org/wordprocessingml/2006/main" xmlns:w14="http://schemas.microsoft.com/office/word/2010/wordml" xmlns:w15="http://schemas.microsoft.com/office/word/2012/wordml" xmlns:w16cex="http://schemas.microsoft.com/office/word/2018/wordml/cex" xmlns:w16cid="http://schemas.microsoft.com/office/word/2016/wordml/cid" xmlns:w16="http://schemas.microsoft.com/office/word/2018/wordml" xmlns:w16du="http://schemas.microsoft.com/office/word/2023/wordml/word16du" xmlns:w16sdtdh="http://schemas.microsoft.com/office/word/2020/wordml/sdtdatahash" xmlns:w16sdtfl="http://schemas.microsoft.com/office/word/2024/wordml/sdtformatlock" xmlns:w16se="http://schemas.microsoft.com/office/word/2015/wordml/symex" xmlns:wpg="http://schemas.microsoft.com/office/word/2010/wordprocessingGroup" xmlns:wpi="http://schemas.microsoft.com/office/word/2010/wordprocessingInk" xmlns:wne="http://schemas.microsoft.com/office/word/2006/wordml" xmlns:wps="http://schemas.microsoft.com/office/word/2010/wordprocessingShape" mc:Ignorable="w14 w15 w16se w16cid w16 w16cex w16sdtdh w16sdtfl w16du wp14">
+  <w:endnote w:type="separator" w:id="-1">
+    <w:p>
+      <w:pPr>
+        <w:spacing w:after="0" w:line="240" w:lineRule="auto"/>
+      </w:pPr>
+      <w:r>
+        <w:separator/>
+      </w:r>
+    </w:p>
+  </w:endnote>
+  <w:endnote w:type="continuationSeparator" w:id="0">
+    <w:p>
+      <w:pPr>
+        <w:spacing w:after="0" w:line="240" w:lineRule="auto"/>
+      </w:pPr>
+      <w:r>
+        <w:continuationSeparator/>
+      </w:r>
+    </w:p>
+  </w:endnote>
+</w:endnotes>
+</file>
+
+<file path=word/footnotes.xml><?xml version="1.0" encoding="utf-8"?>
+<w:footnotes xmlns:wpc="http://schemas.microsoft.com/office/word/2010/wordprocessingCanvas" xmlns:cx="http://schemas.microsoft.com/office/drawing/2014/chartex" xmlns:cx1="http://schemas.microsoft.com/office/drawing/2015/9/8/chartex" xmlns:cx2="http://schemas.microsoft.com/office/drawing/2015/10/21/chartex" xmlns:cx3="http://schemas.microsoft.com/office/drawing/2016/5/9/chartex" xmlns:cx4="http://schemas.microsoft.com/office/drawing/2016/5/10/chartex" xmlns:cx5="http://schemas.microsoft.com/office/drawing/2016/5/11/chartex" xmlns:cx6="http://schemas.microsoft.com/office/drawing/2016/5/12/chartex" xmlns:cx7="http://schemas.microsoft.com/office/drawing/2016/5/13/chartex" xmlns:cx8="http://schemas.microsoft.com/office/drawing/2016/5/14/chartex" xmlns:mc="http://schemas.openxmlformats.org/markup-compatibility/2006" xmlns:aink="http://schemas.microsoft.com/office/drawing/2016/ink" xmlns:am3d="http://schemas.microsoft.com/office/drawing/2017/model3d" xmlns:o="urn:schemas-microsoft-com:office:office" xmlns:oel="http://schemas.microsoft.com/office/2019/extlst" xmlns:r="http://schemas.openxmlformats.org/officeDocument/2006/relationships" xmlns:m="http://schemas.openxmlformats.org/officeDocument/2006/math" xmlns:v="urn:schemas-microsoft-com:vml" xmlns:wp14="http://schemas.microsoft.com/office/word/2010/wordprocessingDrawing" xmlns:wp="http://schemas.openxmlformats.org/drawingml/2006/wordprocessingDrawing" xmlns:w10="urn:schemas-microsoft-com:office:word" xmlns:w="http://schemas.openxmlformats.org/wordprocessingml/2006/main" xmlns:w14="http://schemas.microsoft.com/office/word/2010/wordml" xmlns:w15="http://schemas.microsoft.com/office/word/2012/wordml" xmlns:w16cex="http://schemas.microsoft.com/office/word/2018/wordml/cex" xmlns:w16cid="http://schemas.microsoft.com/office/word/2016/wordml/cid" xmlns:w16="http://schemas.microsoft.com/office/word/2018/wordml" xmlns:w16du="http://schemas.microsoft.com/office/word/2023/wordml/word16du" xmlns:w16sdtdh="http://schemas.microsoft.com/office/word/2020/wordml/sdtdatahash" xmlns:w16sdtfl="http://schemas.microsoft.com/office/word/2024/wordml/sdtformatlock" xmlns:w16se="http://schemas.microsoft.com/office/word/2015/wordml/symex" xmlns:wpg="http://schemas.microsoft.com/office/word/2010/wordprocessingGroup" xmlns:wpi="http://schemas.microsoft.com/office/word/2010/wordprocessingInk" xmlns:wne="http://schemas.microsoft.com/office/word/2006/wordml" xmlns:wps="http://schemas.microsoft.com/office/word/2010/wordprocessingShape" mc:Ignorable="w14 w15 w16se w16cid w16 w16cex w16sdtdh w16sdtfl w16du wp14">
+  <w:footnote w:type="separator" w:id="-1">
+    <w:p>
+      <w:pPr>
+        <w:spacing w:after="0" w:line="240" w:lineRule="auto"/>
+      </w:pPr>
+      <w:r>
+        <w:separator/>
+      </w:r>
+    </w:p>
+  </w:footnote>
+  <w:footnote w:type="continuationSeparator" w:id="0">
+    <w:p>
+      <w:pPr>
+        <w:spacing w:after="0" w:line="240" w:lineRule="auto"/>
+      </w:pPr>
+      <w:r>
+        <w:continuationSeparator/>
+      </w:r>
+    </w:p>
+  </w:footnote>
+</w:footnotes>
+</file>
+
 <file path=word/numbering.xml><?xml version="1.0" encoding="utf-8"?>
 <w:numbering xmlns:wpc="http://schemas.microsoft.com/office/word/2010/wordprocessingCanvas" xmlns:cx="http://schemas.microsoft.com/office/drawing/2014/chartex" xmlns:cx1="http://schemas.microsoft.com/office/drawing/2015/9/8/chartex" xmlns:cx2="http://schemas.microsoft.com/office/drawing/2015/10/21/chartex" xmlns:cx3="http://schemas.microsoft.com/office/drawing/2016/5/9/chartex" xmlns:cx4="http://schemas.microsoft.com/office/drawing/2016/5/10/chartex" xmlns:cx5="http://schemas.microsoft.com/office/drawing/2016/5/11/chartex" xmlns:cx6="http://schemas.microsoft.com/office/drawing/2016/5/12/chartex" xmlns:cx7="http://schemas.microsoft.com/office/drawing/2016/5/13/chartex" xmlns:cx8="http://schemas.microsoft.com/office/drawing/2016/5/14/chartex" xmlns:mc="http://schemas.openxmlformats.org/markup-compatibility/2006" xmlns:aink="http://schemas.microsoft.com/office/drawing/2016/ink" xmlns:am3d="http://schemas.microsoft.com/office/drawing/2017/model3d" xmlns:o="urn:schemas-microsoft-com:office:office" xmlns:oel="http://schemas.microsoft.com/office/2019/extlst" xmlns:r="http://schemas.openxmlformats.org/officeDocument/2006/relationships" xmlns:m="http://schemas.openxmlformats.org/officeDocument/2006/math" xmlns:v="urn:schemas-microsoft-com:vml" xmlns:wp14="http://schemas.microsoft.com/office/word/2010/wordprocessingDrawing" xmlns:wp="http://schemas.openxmlformats.org/drawingml/2006/wordprocessingDrawing" xmlns:w10="urn:schemas-microsoft-com:office:word" xmlns:w="http://schemas.openxmlformats.org/wordprocessingml/2006/main" xmlns:w14="http://schemas.microsoft.com/office/word/2010/wordml" xmlns:w15="http://schemas.microsoft.com/office/word/2012/wordml" xmlns:w16cex="http://schemas.microsoft.com/office/word/2018/wordml/cex" xmlns:w16cid="http://schemas.microsoft.com/office/word/2016/wordml/cid" xmlns:w16="http://schemas.microsoft.com/office/word/2018/wordml" xmlns:w16du="http://schemas.microsoft.com/office/word/2023/wordml/word16du" xmlns:w16sdtdh="http://schemas.microsoft.com/office/word/2020/wordml/sdtdatahash" xmlns:w16sdtfl="http://schemas.microsoft.com/office/word/2024/wordml/sdtformatlock" xmlns:w16se="http://schemas.microsoft.com/office/word/2015/wordml/symex" xmlns:wpg="http://schemas.microsoft.com/office/word/2010/wordprocessingGroup" xmlns:wpi="http://schemas.microsoft.com/office/word/2010/wordprocessingInk" xmlns:wne="http://schemas.microsoft.com/office/word/2006/wordml" xmlns:wps="http://schemas.microsoft.com/office/word/2010/wordprocessingShape" mc:Ignorable="w14 w15 w16se w16cid w16 w16cex w16sdtdh w16sdtfl w16du wp14">
   <w:abstractNum w:abstractNumId="0" w15:restartNumberingAfterBreak="0">
@@ -7757,6 +8281,119 @@
     </w:lvl>
   </w:abstractNum>
   <w:abstractNum w:abstractNumId="16" w15:restartNumberingAfterBreak="0">
+    <w:nsid w:val="73293D7E"/>
+    <w:multiLevelType w:val="hybridMultilevel"/>
+    <w:tmpl w:val="97D2FA98"/>
+    <w:lvl w:ilvl="0" w:tplc="04090001">
+      <w:start w:val="1"/>
+      <w:numFmt w:val="bullet"/>
+      <w:lvlText w:val=""/>
+      <w:lvlJc w:val="left"/>
+      <w:pPr>
+        <w:ind w:left="720" w:hanging="360"/>
+      </w:pPr>
+      <w:rPr>
+        <w:rFonts w:ascii="Symbol" w:hAnsi="Symbol" w:hint="default"/>
+      </w:rPr>
+    </w:lvl>
+    <w:lvl w:ilvl="1" w:tplc="04090003" w:tentative="1">
+      <w:start w:val="1"/>
+      <w:numFmt w:val="bullet"/>
+      <w:lvlText w:val="o"/>
+      <w:lvlJc w:val="left"/>
+      <w:pPr>
+        <w:ind w:left="1440" w:hanging="360"/>
+      </w:pPr>
+      <w:rPr>
+        <w:rFonts w:ascii="Courier New" w:hAnsi="Courier New" w:cs="Courier New" w:hint="default"/>
+      </w:rPr>
+    </w:lvl>
+    <w:lvl w:ilvl="2" w:tplc="04090005" w:tentative="1">
+      <w:start w:val="1"/>
+      <w:numFmt w:val="bullet"/>
+      <w:lvlText w:val=""/>
+      <w:lvlJc w:val="left"/>
+      <w:pPr>
+        <w:ind w:left="2160" w:hanging="360"/>
+      </w:pPr>
+      <w:rPr>
+        <w:rFonts w:ascii="Wingdings" w:hAnsi="Wingdings" w:hint="default"/>
+      </w:rPr>
+    </w:lvl>
+    <w:lvl w:ilvl="3" w:tplc="04090001" w:tentative="1">
+      <w:start w:val="1"/>
+      <w:numFmt w:val="bullet"/>
+      <w:lvlText w:val=""/>
+      <w:lvlJc w:val="left"/>
+      <w:pPr>
+        <w:ind w:left="2880" w:hanging="360"/>
+      </w:pPr>
+      <w:rPr>
+        <w:rFonts w:ascii="Symbol" w:hAnsi="Symbol" w:hint="default"/>
+      </w:rPr>
+    </w:lvl>
+    <w:lvl w:ilvl="4" w:tplc="04090003" w:tentative="1">
+      <w:start w:val="1"/>
+      <w:numFmt w:val="bullet"/>
+      <w:lvlText w:val="o"/>
+      <w:lvlJc w:val="left"/>
+      <w:pPr>
+        <w:ind w:left="3600" w:hanging="360"/>
+      </w:pPr>
+      <w:rPr>
+        <w:rFonts w:ascii="Courier New" w:hAnsi="Courier New" w:cs="Courier New" w:hint="default"/>
+      </w:rPr>
+    </w:lvl>
+    <w:lvl w:ilvl="5" w:tplc="04090005" w:tentative="1">
+      <w:start w:val="1"/>
+      <w:numFmt w:val="bullet"/>
+      <w:lvlText w:val=""/>
+      <w:lvlJc w:val="left"/>
+      <w:pPr>
+        <w:ind w:left="4320" w:hanging="360"/>
+      </w:pPr>
+      <w:rPr>
+        <w:rFonts w:ascii="Wingdings" w:hAnsi="Wingdings" w:hint="default"/>
+      </w:rPr>
+    </w:lvl>
+    <w:lvl w:ilvl="6" w:tplc="04090001" w:tentative="1">
+      <w:start w:val="1"/>
+      <w:numFmt w:val="bullet"/>
+      <w:lvlText w:val=""/>
+      <w:lvlJc w:val="left"/>
+      <w:pPr>
+        <w:ind w:left="5040" w:hanging="360"/>
+      </w:pPr>
+      <w:rPr>
+        <w:rFonts w:ascii="Symbol" w:hAnsi="Symbol" w:hint="default"/>
+      </w:rPr>
+    </w:lvl>
+    <w:lvl w:ilvl="7" w:tplc="04090003" w:tentative="1">
+      <w:start w:val="1"/>
+      <w:numFmt w:val="bullet"/>
+      <w:lvlText w:val="o"/>
+      <w:lvlJc w:val="left"/>
+      <w:pPr>
+        <w:ind w:left="5760" w:hanging="360"/>
+      </w:pPr>
+      <w:rPr>
+        <w:rFonts w:ascii="Courier New" w:hAnsi="Courier New" w:cs="Courier New" w:hint="default"/>
+      </w:rPr>
+    </w:lvl>
+    <w:lvl w:ilvl="8" w:tplc="04090005" w:tentative="1">
+      <w:start w:val="1"/>
+      <w:numFmt w:val="bullet"/>
+      <w:lvlText w:val=""/>
+      <w:lvlJc w:val="left"/>
+      <w:pPr>
+        <w:ind w:left="6480" w:hanging="360"/>
+      </w:pPr>
+      <w:rPr>
+        <w:rFonts w:ascii="Wingdings" w:hAnsi="Wingdings" w:hint="default"/>
+      </w:rPr>
+    </w:lvl>
+  </w:abstractNum>
+  <w:abstractNum w:abstractNumId="17" w15:restartNumberingAfterBreak="0">
     <w:nsid w:val="73460602"/>
     <w:multiLevelType w:val="hybridMultilevel"/>
     <w:tmpl w:val="37F40BFA"/>
@@ -7869,7 +8506,7 @@
       </w:rPr>
     </w:lvl>
   </w:abstractNum>
-  <w:abstractNum w:abstractNumId="17" w15:restartNumberingAfterBreak="0">
+  <w:abstractNum w:abstractNumId="18" w15:restartNumberingAfterBreak="0">
     <w:nsid w:val="767E0D7F"/>
     <w:multiLevelType w:val="hybridMultilevel"/>
     <w:tmpl w:val="B9B84406"/>
@@ -7977,7 +8614,7 @@
     <w:abstractNumId w:val="8"/>
   </w:num>
   <w:num w:numId="8" w16cid:durableId="1875848332">
-    <w:abstractNumId w:val="17"/>
+    <w:abstractNumId w:val="18"/>
   </w:num>
   <w:num w:numId="9" w16cid:durableId="1071388938">
     <w:abstractNumId w:val="12"/>
@@ -7998,7 +8635,7 @@
     <w:abstractNumId w:val="0"/>
   </w:num>
   <w:num w:numId="15" w16cid:durableId="1115054325">
-    <w:abstractNumId w:val="16"/>
+    <w:abstractNumId w:val="17"/>
   </w:num>
   <w:num w:numId="16" w16cid:durableId="640306334">
     <w:abstractNumId w:val="7"/>
@@ -8008,6 +8645,9 @@
   </w:num>
   <w:num w:numId="18" w16cid:durableId="232660460">
     <w:abstractNumId w:val="2"/>
+  </w:num>
+  <w:num w:numId="19" w16cid:durableId="55860509">
+    <w:abstractNumId w:val="16"/>
   </w:num>
 </w:numbering>
 </file>
@@ -8613,6 +9253,7 @@
   <w:style w:type="character" w:default="1" w:styleId="DefaultParagraphFont">
     <w:name w:val="Default Paragraph Font"/>
     <w:uiPriority w:val="1"/>
+    <w:semiHidden/>
     <w:unhideWhenUsed/>
   </w:style>
   <w:style w:type="table" w:default="1" w:styleId="TableNormal">
@@ -9029,6 +9670,50 @@
       </w:tcPr>
     </w:tblStylePr>
   </w:style>
+  <w:style w:type="paragraph" w:styleId="Header">
+    <w:name w:val="header"/>
+    <w:basedOn w:val="Normal"/>
+    <w:link w:val="HeaderChar"/>
+    <w:uiPriority w:val="99"/>
+    <w:unhideWhenUsed/>
+    <w:rsid w:val="00DD0764"/>
+    <w:pPr>
+      <w:tabs>
+        <w:tab w:val="center" w:pos="4680"/>
+        <w:tab w:val="right" w:pos="9360"/>
+      </w:tabs>
+      <w:spacing w:after="0" w:line="240" w:lineRule="auto"/>
+    </w:pPr>
+  </w:style>
+  <w:style w:type="character" w:customStyle="1" w:styleId="HeaderChar">
+    <w:name w:val="Header Char"/>
+    <w:basedOn w:val="DefaultParagraphFont"/>
+    <w:link w:val="Header"/>
+    <w:uiPriority w:val="99"/>
+    <w:rsid w:val="00DD0764"/>
+  </w:style>
+  <w:style w:type="paragraph" w:styleId="Footer">
+    <w:name w:val="footer"/>
+    <w:basedOn w:val="Normal"/>
+    <w:link w:val="FooterChar"/>
+    <w:uiPriority w:val="99"/>
+    <w:unhideWhenUsed/>
+    <w:rsid w:val="00DD0764"/>
+    <w:pPr>
+      <w:tabs>
+        <w:tab w:val="center" w:pos="4680"/>
+        <w:tab w:val="right" w:pos="9360"/>
+      </w:tabs>
+      <w:spacing w:after="0" w:line="240" w:lineRule="auto"/>
+    </w:pPr>
+  </w:style>
+  <w:style w:type="character" w:customStyle="1" w:styleId="FooterChar">
+    <w:name w:val="Footer Char"/>
+    <w:basedOn w:val="DefaultParagraphFont"/>
+    <w:link w:val="Footer"/>
+    <w:uiPriority w:val="99"/>
+    <w:rsid w:val="00DD0764"/>
+  </w:style>
 </w:styles>
 </file>
 

</xml_diff>